<commit_message>
fix: allow arbitrary advertising platforms in contract templates
</commit_message>
<xml_diff>
--- a/plugins/blogger-ads-skill/skills/blogger-ads-skill/assets/templates/contract.docx
+++ b/plugins/blogger-ads-skill/skills/blogger-ads-skill/assets/templates/contract.docx
@@ -164,7 +164,7 @@
           <w:sz w:val="22"/>
           <w:szCs w:val="22"/>
         </w:rPr>
-        <w:t xml:space="preserve">1.1. Исполнитель обязуется по заданию Заказчика оказать услуги по размещению рекламных материалов Заказчика (далее — «Реклама») в Telegram-канале «{{CHANNEL_NAME}}» ({{CHANNEL_URL}}, далее — «Канал»), а Заказчик обязуется принять и оплатить оказанные услуги.</w:t>
+        <w:t xml:space="preserve">1.1. Исполнитель обязуется по заданию Заказчика оказать услуги по размещению рекламных материалов Заказчика (далее — «Реклама») на рекламной площадке «{{CHANNEL_NAME}}» ({{CHANNEL_URL}}, далее — «Канал»), а Заказчик обязуется принять и оплатить оказанные услуги.</w:t>
       </w:r>
       <w:r>
         <w:rPr>
@@ -506,7 +506,7 @@
           <w:sz w:val="22"/>
           <w:szCs w:val="22"/>
         </w:rPr>
-        <w:t>Telegram</w:t>
+        <w:t>размещения</w:t>
       </w:r>
       <w:r>
         <w:rPr>

</xml_diff>